<commit_message>
a casa: roba Andrea
</commit_message>
<xml_diff>
--- a/data_out/bes_2003_2023/bes_reddito_m_f_tbl.docx
+++ b/data_out/bes_2003_2023/bes_reddito_m_f_tbl.docx
@@ -43,6 +43,7 @@
           </w:tcPr>
           <w:p>
             <w:pPr>
+              <w:pStyle w:val="Normal"/>
               <w:jc w:val="center"/>
               <w:pBdr>
                 <w:bottom w:val="none" w:sz="0" w:space="0" w:color="000000"/>
@@ -57,7 +58,6 @@
                 <w:i w:val="false"/>
                 <w:b w:val="true"/>
                 <w:u w:val="none"/>
-                <w:strike w:val="false"/>
                 <w:sz w:val="28"/>
                 <w:szCs w:val="28"/>
                 <w:color w:val="000000"/>
@@ -69,7 +69,6 @@
                 <w:i w:val="false"/>
                 <w:b w:val="true"/>
                 <w:u w:val="none"/>
-                <w:strike w:val="false"/>
                 <w:sz w:val="28"/>
                 <w:szCs w:val="28"/>
                 <w:color w:val="000000"/>
@@ -104,6 +103,7 @@
           </w:tcPr>
           <w:p>
             <w:pPr>
+              <w:pStyle w:val="Normal"/>
               <w:jc w:val="left"/>
               <w:pBdr>
                 <w:bottom w:val="none" w:sz="0" w:space="0" w:color="000000"/>
@@ -118,7 +118,6 @@
                 <w:i w:val="false"/>
                 <w:b w:val="true"/>
                 <w:u w:val="none"/>
-                <w:strike w:val="false"/>
                 <w:sz w:val="24"/>
                 <w:szCs w:val="24"/>
                 <w:color w:val="000000"/>
@@ -130,7 +129,6 @@
                 <w:i w:val="false"/>
                 <w:b w:val="true"/>
                 <w:u w:val="none"/>
-                <w:strike w:val="false"/>
                 <w:sz w:val="24"/>
                 <w:szCs w:val="24"/>
                 <w:color w:val="000000"/>
@@ -158,6 +156,7 @@
           </w:tcPr>
           <w:p>
             <w:pPr>
+              <w:pStyle w:val="Normal"/>
               <w:jc w:val="left"/>
               <w:pBdr>
                 <w:bottom w:val="none" w:sz="0" w:space="0" w:color="000000"/>
@@ -172,7 +171,6 @@
                 <w:i w:val="false"/>
                 <w:b w:val="true"/>
                 <w:u w:val="none"/>
-                <w:strike w:val="false"/>
                 <w:sz w:val="24"/>
                 <w:szCs w:val="24"/>
                 <w:color w:val="000000"/>
@@ -184,7 +182,6 @@
                 <w:i w:val="false"/>
                 <w:b w:val="true"/>
                 <w:u w:val="none"/>
-                <w:strike w:val="false"/>
                 <w:sz w:val="24"/>
                 <w:szCs w:val="24"/>
                 <w:color w:val="000000"/>
@@ -212,6 +209,7 @@
           </w:tcPr>
           <w:p>
             <w:pPr>
+              <w:pStyle w:val="Normal"/>
               <w:jc w:val="left"/>
               <w:pBdr>
                 <w:bottom w:val="none" w:sz="0" w:space="0" w:color="000000"/>
@@ -226,7 +224,6 @@
                 <w:i w:val="false"/>
                 <w:b w:val="true"/>
                 <w:u w:val="none"/>
-                <w:strike w:val="false"/>
                 <w:sz w:val="24"/>
                 <w:szCs w:val="24"/>
                 <w:color w:val="000000"/>
@@ -238,7 +235,6 @@
                 <w:i w:val="false"/>
                 <w:b w:val="true"/>
                 <w:u w:val="none"/>
-                <w:strike w:val="false"/>
                 <w:sz w:val="24"/>
                 <w:szCs w:val="24"/>
                 <w:color w:val="000000"/>
@@ -266,6 +262,7 @@
           </w:tcPr>
           <w:p>
             <w:pPr>
+              <w:pStyle w:val="Normal"/>
               <w:jc w:val="right"/>
               <w:pBdr>
                 <w:bottom w:val="none" w:sz="0" w:space="0" w:color="000000"/>
@@ -280,7 +277,6 @@
                 <w:i w:val="false"/>
                 <w:b w:val="true"/>
                 <w:u w:val="none"/>
-                <w:strike w:val="false"/>
                 <w:sz w:val="24"/>
                 <w:szCs w:val="24"/>
                 <w:color w:val="000000"/>
@@ -292,7 +288,6 @@
                 <w:i w:val="false"/>
                 <w:b w:val="true"/>
                 <w:u w:val="none"/>
-                <w:strike w:val="false"/>
                 <w:sz w:val="24"/>
                 <w:szCs w:val="24"/>
                 <w:color w:val="000000"/>
@@ -327,6 +322,7 @@
           </w:tcPr>
           <w:p>
             <w:pPr>
+              <w:pStyle w:val="Normal"/>
               <w:jc w:val="left"/>
               <w:pBdr>
                 <w:bottom w:val="none" w:sz="0" w:space="0" w:color="000000"/>
@@ -341,7 +337,6 @@
                 <w:i w:val="false"/>
                 <w:b w:val="false"/>
                 <w:u w:val="none"/>
-                <w:strike w:val="false"/>
                 <w:sz w:val="24"/>
                 <w:szCs w:val="24"/>
                 <w:color w:val="000000"/>
@@ -353,7 +348,6 @@
                 <w:i w:val="false"/>
                 <w:b w:val="false"/>
                 <w:u w:val="none"/>
-                <w:strike w:val="false"/>
                 <w:sz w:val="24"/>
                 <w:szCs w:val="24"/>
                 <w:color w:val="000000"/>
@@ -382,6 +376,7 @@
           </w:tcPr>
           <w:p>
             <w:pPr>
+              <w:pStyle w:val="Normal"/>
               <w:jc w:val="left"/>
               <w:pBdr>
                 <w:bottom w:val="none" w:sz="0" w:space="0" w:color="000000"/>
@@ -396,7 +391,6 @@
                 <w:i w:val="false"/>
                 <w:b w:val="false"/>
                 <w:u w:val="none"/>
-                <w:strike w:val="false"/>
                 <w:sz w:val="24"/>
                 <w:szCs w:val="24"/>
                 <w:color w:val="000000"/>
@@ -408,7 +402,6 @@
                 <w:i w:val="false"/>
                 <w:b w:val="false"/>
                 <w:u w:val="none"/>
-                <w:strike w:val="false"/>
                 <w:sz w:val="24"/>
                 <w:szCs w:val="24"/>
                 <w:color w:val="000000"/>
@@ -436,6 +429,7 @@
           </w:tcPr>
           <w:p>
             <w:pPr>
+              <w:pStyle w:val="Normal"/>
               <w:jc w:val="left"/>
               <w:pBdr>
                 <w:bottom w:val="none" w:sz="0" w:space="0" w:color="000000"/>
@@ -450,7 +444,6 @@
                 <w:i w:val="false"/>
                 <w:b w:val="false"/>
                 <w:u w:val="none"/>
-                <w:strike w:val="false"/>
                 <w:sz w:val="24"/>
                 <w:szCs w:val="24"/>
                 <w:color w:val="000000"/>
@@ -462,7 +455,6 @@
                 <w:i w:val="false"/>
                 <w:b w:val="false"/>
                 <w:u w:val="none"/>
-                <w:strike w:val="false"/>
                 <w:sz w:val="24"/>
                 <w:szCs w:val="24"/>
                 <w:color w:val="000000"/>
@@ -490,6 +482,7 @@
           </w:tcPr>
           <w:p>
             <w:pPr>
+              <w:pStyle w:val="Normal"/>
               <w:jc w:val="right"/>
               <w:pBdr>
                 <w:bottom w:val="none" w:sz="0" w:space="0" w:color="000000"/>
@@ -504,7 +497,6 @@
                 <w:i w:val="false"/>
                 <w:b w:val="false"/>
                 <w:u w:val="none"/>
-                <w:strike w:val="false"/>
                 <w:sz w:val="24"/>
                 <w:szCs w:val="24"/>
                 <w:color w:val="000000"/>
@@ -516,7 +508,6 @@
                 <w:i w:val="false"/>
                 <w:b w:val="false"/>
                 <w:u w:val="none"/>
-                <w:strike w:val="false"/>
                 <w:sz w:val="24"/>
                 <w:szCs w:val="24"/>
                 <w:color w:val="000000"/>
@@ -551,6 +542,7 @@
           </w:tcPr>
           <w:p>
             <w:pPr>
+              <w:pStyle w:val="Normal"/>
               <w:jc w:val="left"/>
               <w:pBdr>
                 <w:bottom w:val="none" w:sz="0" w:space="0" w:color="000000"/>
@@ -565,7 +557,6 @@
                 <w:i w:val="false"/>
                 <w:b w:val="false"/>
                 <w:u w:val="none"/>
-                <w:strike w:val="false"/>
                 <w:sz w:val="24"/>
                 <w:szCs w:val="24"/>
                 <w:color w:val="000000"/>
@@ -593,6 +584,7 @@
           </w:tcPr>
           <w:p>
             <w:pPr>
+              <w:pStyle w:val="Normal"/>
               <w:jc w:val="left"/>
               <w:pBdr>
                 <w:bottom w:val="none" w:sz="0" w:space="0" w:color="000000"/>
@@ -607,7 +599,6 @@
                 <w:i w:val="false"/>
                 <w:b w:val="false"/>
                 <w:u w:val="none"/>
-                <w:strike w:val="false"/>
                 <w:sz w:val="24"/>
                 <w:szCs w:val="24"/>
                 <w:color w:val="000000"/>
@@ -634,6 +625,7 @@
           </w:tcPr>
           <w:p>
             <w:pPr>
+              <w:pStyle w:val="Normal"/>
               <w:jc w:val="left"/>
               <w:pBdr>
                 <w:bottom w:val="none" w:sz="0" w:space="0" w:color="000000"/>
@@ -648,7 +640,6 @@
                 <w:i w:val="false"/>
                 <w:b w:val="false"/>
                 <w:u w:val="none"/>
-                <w:strike w:val="false"/>
                 <w:sz w:val="24"/>
                 <w:szCs w:val="24"/>
                 <w:color w:val="000000"/>
@@ -660,7 +651,6 @@
                 <w:i w:val="false"/>
                 <w:b w:val="false"/>
                 <w:u w:val="none"/>
-                <w:strike w:val="false"/>
                 <w:sz w:val="24"/>
                 <w:szCs w:val="24"/>
                 <w:color w:val="000000"/>
@@ -688,6 +678,7 @@
           </w:tcPr>
           <w:p>
             <w:pPr>
+              <w:pStyle w:val="Normal"/>
               <w:jc w:val="right"/>
               <w:pBdr>
                 <w:bottom w:val="none" w:sz="0" w:space="0" w:color="000000"/>
@@ -702,7 +693,6 @@
                 <w:i w:val="false"/>
                 <w:b w:val="false"/>
                 <w:u w:val="none"/>
-                <w:strike w:val="false"/>
                 <w:sz w:val="24"/>
                 <w:szCs w:val="24"/>
                 <w:color w:val="000000"/>
@@ -714,7 +704,6 @@
                 <w:i w:val="false"/>
                 <w:b w:val="false"/>
                 <w:u w:val="none"/>
-                <w:strike w:val="false"/>
                 <w:sz w:val="24"/>
                 <w:szCs w:val="24"/>
                 <w:color w:val="000000"/>
@@ -749,6 +738,7 @@
           </w:tcPr>
           <w:p>
             <w:pPr>
+              <w:pStyle w:val="Normal"/>
               <w:jc w:val="left"/>
               <w:pBdr>
                 <w:bottom w:val="none" w:sz="0" w:space="0" w:color="000000"/>
@@ -763,7 +753,6 @@
                 <w:i w:val="false"/>
                 <w:b w:val="false"/>
                 <w:u w:val="none"/>
-                <w:strike w:val="false"/>
                 <w:sz w:val="24"/>
                 <w:szCs w:val="24"/>
                 <w:color w:val="000000"/>
@@ -791,6 +780,7 @@
           </w:tcPr>
           <w:p>
             <w:pPr>
+              <w:pStyle w:val="Normal"/>
               <w:jc w:val="left"/>
               <w:pBdr>
                 <w:bottom w:val="none" w:sz="0" w:space="0" w:color="000000"/>
@@ -805,7 +795,6 @@
                 <w:i w:val="false"/>
                 <w:b w:val="false"/>
                 <w:u w:val="none"/>
-                <w:strike w:val="false"/>
                 <w:sz w:val="24"/>
                 <w:szCs w:val="24"/>
                 <w:color w:val="000000"/>
@@ -817,7 +806,6 @@
                 <w:i w:val="false"/>
                 <w:b w:val="false"/>
                 <w:u w:val="none"/>
-                <w:strike w:val="false"/>
                 <w:sz w:val="24"/>
                 <w:szCs w:val="24"/>
                 <w:color w:val="000000"/>
@@ -845,6 +833,7 @@
           </w:tcPr>
           <w:p>
             <w:pPr>
+              <w:pStyle w:val="Normal"/>
               <w:jc w:val="left"/>
               <w:pBdr>
                 <w:bottom w:val="none" w:sz="0" w:space="0" w:color="000000"/>
@@ -859,7 +848,6 @@
                 <w:i w:val="false"/>
                 <w:b w:val="false"/>
                 <w:u w:val="none"/>
-                <w:strike w:val="false"/>
                 <w:sz w:val="24"/>
                 <w:szCs w:val="24"/>
                 <w:color w:val="000000"/>
@@ -871,7 +859,6 @@
                 <w:i w:val="false"/>
                 <w:b w:val="false"/>
                 <w:u w:val="none"/>
-                <w:strike w:val="false"/>
                 <w:sz w:val="24"/>
                 <w:szCs w:val="24"/>
                 <w:color w:val="000000"/>
@@ -899,6 +886,7 @@
           </w:tcPr>
           <w:p>
             <w:pPr>
+              <w:pStyle w:val="Normal"/>
               <w:jc w:val="right"/>
               <w:pBdr>
                 <w:bottom w:val="none" w:sz="0" w:space="0" w:color="000000"/>
@@ -913,7 +901,6 @@
                 <w:i w:val="false"/>
                 <w:b w:val="false"/>
                 <w:u w:val="none"/>
-                <w:strike w:val="false"/>
                 <w:sz w:val="24"/>
                 <w:szCs w:val="24"/>
                 <w:color w:val="000000"/>
@@ -925,7 +912,6 @@
                 <w:i w:val="false"/>
                 <w:b w:val="false"/>
                 <w:u w:val="none"/>
-                <w:strike w:val="false"/>
                 <w:sz w:val="24"/>
                 <w:szCs w:val="24"/>
                 <w:color w:val="000000"/>
@@ -960,6 +946,7 @@
           </w:tcPr>
           <w:p>
             <w:pPr>
+              <w:pStyle w:val="Normal"/>
               <w:jc w:val="left"/>
               <w:pBdr>
                 <w:bottom w:val="none" w:sz="0" w:space="0" w:color="000000"/>
@@ -974,7 +961,6 @@
                 <w:i w:val="false"/>
                 <w:b w:val="false"/>
                 <w:u w:val="none"/>
-                <w:strike w:val="false"/>
                 <w:sz w:val="24"/>
                 <w:szCs w:val="24"/>
                 <w:color w:val="000000"/>
@@ -1002,6 +988,7 @@
           </w:tcPr>
           <w:p>
             <w:pPr>
+              <w:pStyle w:val="Normal"/>
               <w:jc w:val="left"/>
               <w:pBdr>
                 <w:bottom w:val="none" w:sz="0" w:space="0" w:color="000000"/>
@@ -1016,7 +1003,6 @@
                 <w:i w:val="false"/>
                 <w:b w:val="false"/>
                 <w:u w:val="none"/>
-                <w:strike w:val="false"/>
                 <w:sz w:val="24"/>
                 <w:szCs w:val="24"/>
                 <w:color w:val="000000"/>
@@ -1043,6 +1029,7 @@
           </w:tcPr>
           <w:p>
             <w:pPr>
+              <w:pStyle w:val="Normal"/>
               <w:jc w:val="left"/>
               <w:pBdr>
                 <w:bottom w:val="none" w:sz="0" w:space="0" w:color="000000"/>
@@ -1057,7 +1044,6 @@
                 <w:i w:val="false"/>
                 <w:b w:val="false"/>
                 <w:u w:val="none"/>
-                <w:strike w:val="false"/>
                 <w:sz w:val="24"/>
                 <w:szCs w:val="24"/>
                 <w:color w:val="000000"/>
@@ -1069,7 +1055,6 @@
                 <w:i w:val="false"/>
                 <w:b w:val="false"/>
                 <w:u w:val="none"/>
-                <w:strike w:val="false"/>
                 <w:sz w:val="24"/>
                 <w:szCs w:val="24"/>
                 <w:color w:val="000000"/>
@@ -1097,6 +1082,7 @@
           </w:tcPr>
           <w:p>
             <w:pPr>
+              <w:pStyle w:val="Normal"/>
               <w:jc w:val="right"/>
               <w:pBdr>
                 <w:bottom w:val="none" w:sz="0" w:space="0" w:color="000000"/>
@@ -1111,7 +1097,6 @@
                 <w:i w:val="false"/>
                 <w:b w:val="false"/>
                 <w:u w:val="none"/>
-                <w:strike w:val="false"/>
                 <w:sz w:val="24"/>
                 <w:szCs w:val="24"/>
                 <w:color w:val="000000"/>
@@ -1123,7 +1108,6 @@
                 <w:i w:val="false"/>
                 <w:b w:val="false"/>
                 <w:u w:val="none"/>
-                <w:strike w:val="false"/>
                 <w:sz w:val="24"/>
                 <w:szCs w:val="24"/>
                 <w:color w:val="000000"/>
@@ -1158,6 +1142,7 @@
           </w:tcPr>
           <w:p>
             <w:pPr>
+              <w:pStyle w:val="Normal"/>
               <w:jc w:val="left"/>
               <w:pBdr>
                 <w:bottom w:val="none" w:sz="0" w:space="0" w:color="000000"/>
@@ -1172,7 +1157,6 @@
                 <w:i w:val="true"/>
                 <w:b w:val="false"/>
                 <w:u w:val="none"/>
-                <w:strike w:val="false"/>
                 <w:sz w:val="18"/>
                 <w:szCs w:val="18"/>
                 <w:color w:val="808080"/>
@@ -1184,7 +1168,6 @@
                 <w:i w:val="true"/>
                 <w:b w:val="false"/>
                 <w:u w:val="none"/>
-                <w:strike w:val="false"/>
                 <w:sz w:val="18"/>
                 <w:szCs w:val="18"/>
                 <w:color w:val="808080"/>
@@ -1195,9 +1178,9 @@
         </w:tc>
       </w:tr>
     </w:tbl>
-    <w:sectPr>
-      <w:pgMar w:header="708" w:bottom="1417" w:top="1417" w:right="1417" w:left="1417" w:footer="708" w:gutter="0"/>
-      <w:pgSz w:h="16838" w:w="11906" w:orient="portrait"/>
+    <w:sectPr w:officer="true">
+      <w:pgMar w:header="720" w:bottom="1440" w:top="1440" w:right="1440" w:left="1440" w:footer="720" w:gutter="720"/>
+      <w:pgSz w:h="16848" w:w="11952" w:orient="portrait"/>
       <w:type w:val="continuous"/>
       <w:cols/>
     </w:sectPr>

</xml_diff>